<commit_message>
Add Inbolt CV package with Python scripting and Epson certificate
Co-authored-by: Maciej <WeaverTech@users.noreply.github.com>
</commit_message>
<xml_diff>
--- a/artifacts/redsky-cv/Maciej_Tkacz_CV_RedSky_EN_ATS.docx
+++ b/artifacts/redsky-cv/Maciej_Tkacz_CV_RedSky_EN_ATS.docx
@@ -85,7 +85,7 @@
         <w:ind w:left="198"/>
       </w:pPr>
       <w:r>
-        <w:t>Mechatronics &amp; control: kinematics, control systems, dynamic systems modelling, automation and mechatronics coursework; industrial robot programming (Kawasaki, teach pendant).</w:t>
+        <w:t>Mechatronics &amp; control: kinematics, control systems, dynamic systems modelling, automation and mechatronics coursework; industrial robot programming (Kawasaki, Epson - certified courses, teach pendant).</w:t>
       </w:r>
     </w:p>
     <w:p>
@@ -224,6 +224,16 @@
       </w:pPr>
       <w:r>
         <w:t>Created robotics simulations and digital twins of production workcells in Visual Components for automotive clients.</w:t>
+      </w:r>
+    </w:p>
+    <w:p>
+      <w:pPr>
+        <w:pStyle w:val="ListBullet"/>
+        <w:spacing w:after="20"/>
+        <w:ind w:left="198"/>
+      </w:pPr>
+      <w:r>
+        <w:t>Developed Python scripts for process optimization and for improving simulation behaviour and performance.</w:t>
       </w:r>
     </w:p>
     <w:p>
@@ -461,7 +471,17 @@
         <w:ind w:left="198"/>
       </w:pPr>
       <w:r>
-        <w:t>Kawasaki robot operation and programming - integrator course, ASTOR Robotics Center (May 2022).</w:t>
+        <w:t>Kawasaki robot operation and programming - integrator course with certificate, ASTOR Robotics Center (May 2022).</w:t>
+      </w:r>
+    </w:p>
+    <w:p>
+      <w:pPr>
+        <w:pStyle w:val="ListBullet"/>
+        <w:spacing w:after="20"/>
+        <w:ind w:left="198"/>
+      </w:pPr>
+      <w:r>
+        <w:t>Epson industrial robot programming - certified course.</w:t>
       </w:r>
     </w:p>
     <w:p>

</xml_diff>